<commit_message>
docs: polish formatting and table layouts in proposal V2
</commit_message>
<xml_diff>
--- a/output/docx/Ban_de_xuat_cai_tien_he_thong_du_bao_ngap_V2.docx
+++ b/output/docx/Ban_de_xuat_cai_tien_he_thong_du_bao_ngap_V2.docx
@@ -313,7 +313,7 @@
         <w:rPr>
           <w:rFonts w:ascii="Arial" w:hAnsi="Arial" w:eastAsia="Arial"/>
           <w:color w:val="000000"/>
-          <w:sz w:val="22"/>
+          <w:sz w:val="21"/>
         </w:rPr>
         <w:t>Phiên bản 2 giữ mục tiêu của đề tài ban đầu là dự báo sớm ngập cục bộ tại trường học, nhưng thu hẹp bài toán chính về khoảng dự báo 15 đến 30 phút và tách riêng lớp cảnh báo bối cảnh 6 đến 24 giờ. Cách tổ chức này phù hợp hơn với thiết bị hiện có, khả năng thu thập dữ liệu của nhóm và yêu cầu kiểm chứng trong phạm vi một điểm đo tại trường.</w:t>
       </w:r>
@@ -326,7 +326,7 @@
         <w:rPr>
           <w:rFonts w:ascii="Arial" w:hAnsi="Arial" w:eastAsia="Arial"/>
           <w:color w:val="000000"/>
-          <w:sz w:val="22"/>
+          <w:sz w:val="21"/>
         </w:rPr>
         <w:t>Kết luận chính là hệ thống chỉ có thể dự báo ngập cục bộ đáng tin cậy khi bổ sung cảm biến mực nước và gán nhãn bằng mực nước tương lai thực đo. Dữ liệu mô phỏng hoặc mực nước do công thức sinh ra có thể hỗ trợ kiểm tra kỹ thuật, nhưng không được dùng làm bằng chứng đánh giá độc lập cho hiệu năng của mô hình.</w:t>
       </w:r>
@@ -348,7 +348,7 @@
         <w:rPr>
           <w:rFonts w:ascii="Arial" w:hAnsi="Arial" w:eastAsia="Arial"/>
           <w:color w:val="000000"/>
-          <w:sz w:val="22"/>
+          <w:sz w:val="21"/>
         </w:rPr>
         <w:t>Tách dự báo ngập cục bộ 15 đến 30 phút khỏi cảnh báo thủy văn 6 đến 24 giờ.</w:t>
       </w:r>
@@ -362,7 +362,7 @@
         <w:rPr>
           <w:rFonts w:ascii="Arial" w:hAnsi="Arial" w:eastAsia="Arial"/>
           <w:color w:val="000000"/>
-          <w:sz w:val="22"/>
+          <w:sz w:val="21"/>
         </w:rPr>
         <w:t>Định nghĩa nhãn bằng trạng thái ngập trong tương lai thay vì suy ra từ mực nước hiện tại.</w:t>
       </w:r>
@@ -376,7 +376,7 @@
         <w:rPr>
           <w:rFonts w:ascii="Arial" w:hAnsi="Arial" w:eastAsia="Arial"/>
           <w:color w:val="000000"/>
-          <w:sz w:val="22"/>
+          <w:sz w:val="21"/>
         </w:rPr>
         <w:t>Bổ sung cảm biến mực nước và chuẩn hóa cửa sổ thời gian của các đặc trưng.</w:t>
       </w:r>
@@ -390,7 +390,7 @@
         <w:rPr>
           <w:rFonts w:ascii="Arial" w:hAnsi="Arial" w:eastAsia="Arial"/>
           <w:color w:val="000000"/>
-          <w:sz w:val="22"/>
+          <w:sz w:val="21"/>
         </w:rPr>
         <w:t>Đánh giá theo thứ tự thời gian và theo từng sự kiện mưa, không xáo trộn ngẫu nhiên toàn bộ chuỗi.</w:t>
       </w:r>
@@ -404,7 +404,7 @@
         <w:rPr>
           <w:rFonts w:ascii="Arial" w:hAnsi="Arial" w:eastAsia="Arial"/>
           <w:color w:val="000000"/>
-          <w:sz w:val="22"/>
+          <w:sz w:val="21"/>
         </w:rPr>
         <w:t>Dùng Recall lớp nguy hiểm, Precision, F1 Macro, thời gian báo trước và số cảnh báo giả làm chỉ số chính.</w:t>
       </w:r>
@@ -418,7 +418,7 @@
         <w:rPr>
           <w:rFonts w:ascii="Arial" w:hAnsi="Arial" w:eastAsia="Arial"/>
           <w:color w:val="000000"/>
-          <w:sz w:val="22"/>
+          <w:sz w:val="21"/>
         </w:rPr>
         <w:t>Tách dữ liệu quan trắc, dữ liệu ước lượng và dữ liệu giả lập trong toàn bộ pipeline.</w:t>
       </w:r>
@@ -448,7 +448,7 @@
         <w:rPr>
           <w:rFonts w:ascii="Arial" w:hAnsi="Arial" w:eastAsia="Arial"/>
           <w:color w:val="000000"/>
-          <w:sz w:val="22"/>
+          <w:sz w:val="21"/>
         </w:rPr>
         <w:t>Bài toán xuất phát từ nhu cầu thực tế tại trường và có đối tượng sử dụng rõ ràng.</w:t>
       </w:r>
@@ -462,7 +462,7 @@
         <w:rPr>
           <w:rFonts w:ascii="Arial" w:hAnsi="Arial" w:eastAsia="Arial"/>
           <w:color w:val="000000"/>
-          <w:sz w:val="22"/>
+          <w:sz w:val="21"/>
         </w:rPr>
         <w:t>Kiến trúc cảm biến ESP32 dữ liệu mô hình và dashboard tạo thành một chuỗi sản phẩm có thể trình diễn.</w:t>
       </w:r>
@@ -476,7 +476,7 @@
         <w:rPr>
           <w:rFonts w:ascii="Arial" w:hAnsi="Arial" w:eastAsia="Arial"/>
           <w:color w:val="000000"/>
-          <w:sz w:val="22"/>
+          <w:sz w:val="21"/>
         </w:rPr>
         <w:t>Phiên bản 1 đã lựa chọn đúng nhóm thuật toán bảng dễ giải thích gồm Logistic Regression Decision Tree và Random Forest.</w:t>
       </w:r>
@@ -490,7 +490,7 @@
         <w:rPr>
           <w:rFonts w:ascii="Arial" w:hAnsi="Arial" w:eastAsia="Arial"/>
           <w:color w:val="000000"/>
-          <w:sz w:val="22"/>
+          <w:sz w:val="21"/>
         </w:rPr>
         <w:t>Việc ưu tiên Recall cho lớp nguy hiểm phù hợp với bài toán cảnh báo an toàn.</w:t>
       </w:r>
@@ -586,6 +586,9 @@
         </w:tc>
       </w:tr>
       <w:tr>
+        <w:trPr>
+          <w:cantSplit w:val="true"/>
+        </w:trPr>
         <w:tc>
           <w:tcPr>
             <w:tcW w:type="dxa" w:w="2088"/>
@@ -644,6 +647,9 @@
         </w:tc>
       </w:tr>
       <w:tr>
+        <w:trPr>
+          <w:cantSplit w:val="true"/>
+        </w:trPr>
         <w:tc>
           <w:tcPr>
             <w:tcW w:type="dxa" w:w="2088"/>
@@ -702,6 +708,9 @@
         </w:tc>
       </w:tr>
       <w:tr>
+        <w:trPr>
+          <w:cantSplit w:val="true"/>
+        </w:trPr>
         <w:tc>
           <w:tcPr>
             <w:tcW w:type="dxa" w:w="2088"/>
@@ -760,6 +769,9 @@
         </w:tc>
       </w:tr>
       <w:tr>
+        <w:trPr>
+          <w:cantSplit w:val="true"/>
+        </w:trPr>
         <w:tc>
           <w:tcPr>
             <w:tcW w:type="dxa" w:w="2088"/>
@@ -818,6 +830,9 @@
         </w:tc>
       </w:tr>
       <w:tr>
+        <w:trPr>
+          <w:cantSplit w:val="true"/>
+        </w:trPr>
         <w:tc>
           <w:tcPr>
             <w:tcW w:type="dxa" w:w="2088"/>
@@ -876,6 +891,9 @@
         </w:tc>
       </w:tr>
       <w:tr>
+        <w:trPr>
+          <w:cantSplit w:val="true"/>
+        </w:trPr>
         <w:tc>
           <w:tcPr>
             <w:tcW w:type="dxa" w:w="2088"/>
@@ -955,14 +973,9 @@
         <w:rPr>
           <w:rFonts w:ascii="Arial" w:hAnsi="Arial" w:eastAsia="Arial"/>
           <w:color w:val="000000"/>
-          <w:sz w:val="22"/>
+          <w:sz w:val="21"/>
         </w:rPr>
         <w:t>Đề tài nên tập trung vào nowcasting ngập cục bộ tại một vị trí trong trường với thời gian báo trước 15 và 30 phút. Cảnh báo 6 đến 24 giờ từ dự báo mưa và dữ liệu thủy văn chỉ đóng vai trò bối cảnh để nhà trường chuẩn bị, không thay thế kết quả cảm biến tại chỗ.</w:t>
-      </w:r>
-    </w:p>
-    <w:p>
-      <w:r>
-        <w:br w:type="page"/>
       </w:r>
     </w:p>
     <w:p>
@@ -981,7 +994,7 @@
         <w:rPr>
           <w:rFonts w:ascii="Arial" w:hAnsi="Arial" w:eastAsia="Arial"/>
           <w:color w:val="000000"/>
-          <w:sz w:val="22"/>
+          <w:sz w:val="21"/>
         </w:rPr>
         <w:t>Tên đề tài đề xuất  Nghiên cứu và xây dựng hệ thống IoT kết hợp học máy dự báo nguy cơ ngập cục bộ trước 15 đến 30 phút tại một vị trí trong khuôn viên Trường THPT Trần Quý Cáp.</w:t>
       </w:r>
@@ -1002,7 +1015,7 @@
         <w:rPr>
           <w:rFonts w:ascii="Arial" w:hAnsi="Arial" w:eastAsia="Arial"/>
           <w:color w:val="000000"/>
-          <w:sz w:val="22"/>
+          <w:sz w:val="21"/>
         </w:rPr>
         <w:t>Tại thời điểm t hệ thống sử dụng chuỗi mưa và mực nước gần nhất để dự báo trạng thái ngập tại thời điểm t cộng 15 phút và t cộng 30 phút. Kết quả gồm ba mức An toàn Cảnh báo và Nguy hiểm cao.</w:t>
       </w:r>
@@ -1024,7 +1037,7 @@
         <w:rPr>
           <w:rFonts w:ascii="Arial" w:hAnsi="Arial" w:eastAsia="Arial"/>
           <w:color w:val="000000"/>
-          <w:sz w:val="22"/>
+          <w:sz w:val="21"/>
         </w:rPr>
         <w:t>Một vị trí đo đã khảo sát trong khuôn viên trường.</w:t>
       </w:r>
@@ -1038,7 +1051,7 @@
         <w:rPr>
           <w:rFonts w:ascii="Arial" w:hAnsi="Arial" w:eastAsia="Arial"/>
           <w:color w:val="000000"/>
-          <w:sz w:val="22"/>
+          <w:sz w:val="21"/>
         </w:rPr>
         <w:t>Dự báo ngập mặt hoặc đầy rãnh thoát nước tại điểm đo, không tuyên bố dự báo lũ cho toàn thành phố.</w:t>
       </w:r>
@@ -1052,7 +1065,7 @@
         <w:rPr>
           <w:rFonts w:ascii="Arial" w:hAnsi="Arial" w:eastAsia="Arial"/>
           <w:color w:val="000000"/>
-          <w:sz w:val="22"/>
+          <w:sz w:val="21"/>
         </w:rPr>
         <w:t>Prototype phục vụ nghiên cứu và diễn tập, không tự động ra quyết định sơ tán hoặc ngắt điện.</w:t>
       </w:r>
@@ -1066,7 +1079,7 @@
         <w:rPr>
           <w:rFonts w:ascii="Arial" w:hAnsi="Arial" w:eastAsia="Arial"/>
           <w:color w:val="000000"/>
-          <w:sz w:val="22"/>
+          <w:sz w:val="21"/>
         </w:rPr>
         <w:t>Dữ liệu bên ngoài chỉ được dùng khi có dấu thời gian, nguồn và cờ chất lượng rõ ràng.</w:t>
       </w:r>
@@ -1087,7 +1100,7 @@
         <w:rPr>
           <w:rFonts w:ascii="Arial" w:hAnsi="Arial" w:eastAsia="Arial"/>
           <w:color w:val="000000"/>
-          <w:sz w:val="22"/>
+          <w:sz w:val="21"/>
         </w:rPr>
         <w:t>Câu hỏi nghiên cứu  Chuỗi cường độ mưa lượng mưa tích lũy mực nước và tốc độ dâng nước có giúp mô hình dự báo đúng trạng thái ngập tại điểm đo trước 15 đến 30 phút trên các sự kiện mưa chưa từng được dùng để huấn luyện hay không.</w:t>
       </w:r>
@@ -1100,7 +1113,7 @@
         <w:rPr>
           <w:rFonts w:ascii="Arial" w:hAnsi="Arial" w:eastAsia="Arial"/>
           <w:color w:val="000000"/>
-          <w:sz w:val="22"/>
+          <w:sz w:val="21"/>
         </w:rPr>
         <w:t>Giả thuyết  Khi dữ liệu cảm biến được lấy mẫu ổn định và nhãn được xác định bằng mực nước tương lai thực đo mô hình đa biến sẽ nhận diện lớp nguy hiểm tốt hơn phương pháp chỉ dùng ngưỡng mưa hoặc ngưỡng mực nước hiện tại. Giả thuyết được chấp nhận hoặc bác bỏ dựa trên tập kiểm định theo thời gian.</w:t>
       </w:r>
@@ -1129,7 +1142,7 @@
         <w:rPr>
           <w:rFonts w:ascii="Arial" w:hAnsi="Arial" w:eastAsia="Arial"/>
           <w:color w:val="000000"/>
-          <w:sz w:val="22"/>
+          <w:sz w:val="21"/>
         </w:rPr>
         <w:t>Xây dựng và kiểm định một prototype IoT có khả năng đo mưa đo mực nước truyền dữ liệu không dây và dự báo nguy cơ ngập cục bộ trước 15 đến 30 phút tại một điểm đo trong trường.</w:t>
       </w:r>
@@ -1151,7 +1164,7 @@
         <w:rPr>
           <w:rFonts w:ascii="Arial" w:hAnsi="Arial" w:eastAsia="Arial"/>
           <w:color w:val="000000"/>
-          <w:sz w:val="22"/>
+          <w:sz w:val="21"/>
         </w:rPr>
         <w:t>Hoàn thiện trạm đo sử dụng ESP32 cảm biến mưa RS485 và cảm biến mực nước.</w:t>
       </w:r>
@@ -1165,7 +1178,7 @@
         <w:rPr>
           <w:rFonts w:ascii="Arial" w:hAnsi="Arial" w:eastAsia="Arial"/>
           <w:color w:val="000000"/>
-          <w:sz w:val="22"/>
+          <w:sz w:val="21"/>
         </w:rPr>
         <w:t>Xây dựng dữ liệu chuỗi thời gian có cờ chất lượng và phân biệt dữ liệu thực với dữ liệu giả lập.</w:t>
       </w:r>
@@ -1179,7 +1192,7 @@
         <w:rPr>
           <w:rFonts w:ascii="Arial" w:hAnsi="Arial" w:eastAsia="Arial"/>
           <w:color w:val="000000"/>
-          <w:sz w:val="22"/>
+          <w:sz w:val="21"/>
         </w:rPr>
         <w:t>So sánh baseline ngưỡng với Logistic Regression Decision Tree và Random Forest.</w:t>
       </w:r>
@@ -1193,7 +1206,7 @@
         <w:rPr>
           <w:rFonts w:ascii="Arial" w:hAnsi="Arial" w:eastAsia="Arial"/>
           <w:color w:val="000000"/>
-          <w:sz w:val="22"/>
+          <w:sz w:val="21"/>
         </w:rPr>
         <w:t>Đánh giá mô hình trên các sự kiện mưa độc lập theo thứ tự thời gian.</w:t>
       </w:r>
@@ -1207,7 +1220,7 @@
         <w:rPr>
           <w:rFonts w:ascii="Arial" w:hAnsi="Arial" w:eastAsia="Arial"/>
           <w:color w:val="000000"/>
-          <w:sz w:val="22"/>
+          <w:sz w:val="21"/>
         </w:rPr>
         <w:t>Hiển thị dữ liệu cảnh báo và tình trạng thiết bị trên dashboard kèm nhật ký Telegram.</w:t>
       </w:r>
@@ -1285,14 +1298,9 @@
         <w:rPr>
           <w:rFonts w:ascii="Arial" w:hAnsi="Arial" w:eastAsia="Arial"/>
           <w:color w:val="000000"/>
-          <w:sz w:val="22"/>
+          <w:sz w:val="21"/>
         </w:rPr>
         <w:t>Lớp gần sử dụng dữ liệu cảm biến tại trường để dự báo 15 đến 30 phút. Lớp bối cảnh sử dụng dữ liệu khí tượng thủy văn bên ngoài để đưa ra xu thế 6 đến 24 giờ. Dashboard phải hiển thị rõ nguồn và khoảng dự báo để người dùng không nhầm hai kết quả.</w:t>
-      </w:r>
-    </w:p>
-    <w:p>
-      <w:r>
-        <w:br w:type="page"/>
       </w:r>
     </w:p>
     <w:p>
@@ -1446,6 +1454,9 @@
         </w:tc>
       </w:tr>
       <w:tr>
+        <w:trPr>
+          <w:cantSplit w:val="true"/>
+        </w:trPr>
         <w:tc>
           <w:tcPr>
             <w:tcW w:type="dxa" w:w="1800"/>
@@ -1560,6 +1571,9 @@
         </w:tc>
       </w:tr>
       <w:tr>
+        <w:trPr>
+          <w:cantSplit w:val="true"/>
+        </w:trPr>
         <w:tc>
           <w:tcPr>
             <w:tcW w:type="dxa" w:w="1800"/>
@@ -1674,6 +1688,9 @@
         </w:tc>
       </w:tr>
       <w:tr>
+        <w:trPr>
+          <w:cantSplit w:val="true"/>
+        </w:trPr>
         <w:tc>
           <w:tcPr>
             <w:tcW w:type="dxa" w:w="1800"/>
@@ -1788,6 +1805,9 @@
         </w:tc>
       </w:tr>
       <w:tr>
+        <w:trPr>
+          <w:cantSplit w:val="true"/>
+        </w:trPr>
         <w:tc>
           <w:tcPr>
             <w:tcW w:type="dxa" w:w="1800"/>
@@ -1902,6 +1922,9 @@
         </w:tc>
       </w:tr>
       <w:tr>
+        <w:trPr>
+          <w:cantSplit w:val="true"/>
+        </w:trPr>
         <w:tc>
           <w:tcPr>
             <w:tcW w:type="dxa" w:w="1800"/>
@@ -2016,6 +2039,9 @@
         </w:tc>
       </w:tr>
       <w:tr>
+        <w:trPr>
+          <w:cantSplit w:val="true"/>
+        </w:trPr>
         <w:tc>
           <w:tcPr>
             <w:tcW w:type="dxa" w:w="1800"/>
@@ -2130,6 +2156,9 @@
         </w:tc>
       </w:tr>
       <w:tr>
+        <w:trPr>
+          <w:cantSplit w:val="true"/>
+        </w:trPr>
         <w:tc>
           <w:tcPr>
             <w:tcW w:type="dxa" w:w="1800"/>
@@ -2265,7 +2294,7 @@
         <w:rPr>
           <w:rFonts w:ascii="Arial" w:hAnsi="Arial" w:eastAsia="Arial"/>
           <w:color w:val="000000"/>
-          <w:sz w:val="22"/>
+          <w:sz w:val="21"/>
         </w:rPr>
         <w:t>Nhãn tại thời điểm t phải được xác định từ mực nước thực đo ở tương lai t cộng h. Với h bằng 15 hoặc 30 phút hệ thống phân loại theo hai ngưỡng thực địa do nhóm khảo sát tại điểm đặt cảm biến. Ngưỡng của trạm thủy văn Câu Lâu không được dùng thay cho ngưỡng ngập trong sân trường.</w:t>
       </w:r>
@@ -2353,6 +2382,9 @@
         </w:tc>
       </w:tr>
       <w:tr>
+        <w:trPr>
+          <w:cantSplit w:val="true"/>
+        </w:trPr>
         <w:tc>
           <w:tcPr>
             <w:tcW w:type="dxa" w:w="2232"/>
@@ -2411,6 +2443,9 @@
         </w:tc>
       </w:tr>
       <w:tr>
+        <w:trPr>
+          <w:cantSplit w:val="true"/>
+        </w:trPr>
         <w:tc>
           <w:tcPr>
             <w:tcW w:type="dxa" w:w="2232"/>
@@ -2469,6 +2504,9 @@
         </w:tc>
       </w:tr>
       <w:tr>
+        <w:trPr>
+          <w:cantSplit w:val="true"/>
+        </w:trPr>
         <w:tc>
           <w:tcPr>
             <w:tcW w:type="dxa" w:w="2232"/>
@@ -2549,7 +2587,7 @@
         <w:rPr>
           <w:rFonts w:ascii="Arial" w:hAnsi="Arial" w:eastAsia="Arial"/>
           <w:color w:val="000000"/>
-          <w:sz w:val="22"/>
+          <w:sz w:val="21"/>
         </w:rPr>
         <w:t>Chỉ dùng thông tin có sẵn tại hoặc trước thời điểm t làm input.</w:t>
       </w:r>
@@ -2563,7 +2601,7 @@
         <w:rPr>
           <w:rFonts w:ascii="Arial" w:hAnsi="Arial" w:eastAsia="Arial"/>
           <w:color w:val="000000"/>
-          <w:sz w:val="22"/>
+          <w:sz w:val="21"/>
         </w:rPr>
         <w:t>Không dùng mực nước tương lai trong feature engineering.</w:t>
       </w:r>
@@ -2577,7 +2615,7 @@
         <w:rPr>
           <w:rFonts w:ascii="Arial" w:hAnsi="Arial" w:eastAsia="Arial"/>
           <w:color w:val="000000"/>
-          <w:sz w:val="22"/>
+          <w:sz w:val="21"/>
         </w:rPr>
         <w:t>Dòng cuối không có đủ tương lai phải loại khỏi tập huấn luyện.</w:t>
       </w:r>
@@ -2591,7 +2629,7 @@
         <w:rPr>
           <w:rFonts w:ascii="Arial" w:hAnsi="Arial" w:eastAsia="Arial"/>
           <w:color w:val="000000"/>
-          <w:sz w:val="22"/>
+          <w:sz w:val="21"/>
         </w:rPr>
         <w:t>Chuẩn hóa và điền thiếu phải được học trên tập train rồi áp dụng cho validation và test.</w:t>
       </w:r>
@@ -2605,7 +2643,7 @@
         <w:rPr>
           <w:rFonts w:ascii="Arial" w:hAnsi="Arial" w:eastAsia="Arial"/>
           <w:color w:val="000000"/>
-          <w:sz w:val="22"/>
+          <w:sz w:val="21"/>
         </w:rPr>
         <w:t>Một sự kiện mưa không được chia đồng thời vào train và test.</w:t>
       </w:r>
@@ -2739,6 +2777,9 @@
         </w:tc>
       </w:tr>
       <w:tr>
+        <w:trPr>
+          <w:cantSplit w:val="true"/>
+        </w:trPr>
         <w:tc>
           <w:tcPr>
             <w:tcW w:type="dxa" w:w="2952"/>
@@ -2825,6 +2866,9 @@
         </w:tc>
       </w:tr>
       <w:tr>
+        <w:trPr>
+          <w:cantSplit w:val="true"/>
+        </w:trPr>
         <w:tc>
           <w:tcPr>
             <w:tcW w:type="dxa" w:w="2952"/>
@@ -2911,6 +2955,9 @@
         </w:tc>
       </w:tr>
       <w:tr>
+        <w:trPr>
+          <w:cantSplit w:val="true"/>
+        </w:trPr>
         <w:tc>
           <w:tcPr>
             <w:tcW w:type="dxa" w:w="2952"/>
@@ -2997,6 +3044,9 @@
         </w:tc>
       </w:tr>
       <w:tr>
+        <w:trPr>
+          <w:cantSplit w:val="true"/>
+        </w:trPr>
         <w:tc>
           <w:tcPr>
             <w:tcW w:type="dxa" w:w="2952"/>
@@ -3083,6 +3133,9 @@
         </w:tc>
       </w:tr>
       <w:tr>
+        <w:trPr>
+          <w:cantSplit w:val="true"/>
+        </w:trPr>
         <w:tc>
           <w:tcPr>
             <w:tcW w:type="dxa" w:w="2952"/>
@@ -3169,6 +3222,9 @@
         </w:tc>
       </w:tr>
       <w:tr>
+        <w:trPr>
+          <w:cantSplit w:val="true"/>
+        </w:trPr>
         <w:tc>
           <w:tcPr>
             <w:tcW w:type="dxa" w:w="2952"/>
@@ -3277,7 +3333,7 @@
         <w:rPr>
           <w:rFonts w:ascii="Arial" w:hAnsi="Arial" w:eastAsia="Arial"/>
           <w:color w:val="000000"/>
-          <w:sz w:val="22"/>
+          <w:sz w:val="21"/>
         </w:rPr>
         <w:t>Cảm biến mực nước chống nước phù hợp khoảng đo thực tế.</w:t>
       </w:r>
@@ -3291,7 +3347,7 @@
         <w:rPr>
           <w:rFonts w:ascii="Arial" w:hAnsi="Arial" w:eastAsia="Arial"/>
           <w:color w:val="000000"/>
-          <w:sz w:val="22"/>
+          <w:sz w:val="21"/>
         </w:rPr>
         <w:t>Bộ hạ áp 12V xuống 5V nếu mạch mở rộng không nhận trực tiếp 12V.</w:t>
       </w:r>
@@ -3305,7 +3361,7 @@
         <w:rPr>
           <w:rFonts w:ascii="Arial" w:hAnsi="Arial" w:eastAsia="Arial"/>
           <w:color w:val="000000"/>
-          <w:sz w:val="22"/>
+          <w:sz w:val="21"/>
         </w:rPr>
         <w:t>Module RS485 3,3V hoặc bộ chuyển mức logic khi module hiện tại xuất TTL 5V.</w:t>
       </w:r>
@@ -3319,7 +3375,7 @@
         <w:rPr>
           <w:rFonts w:ascii="Arial" w:hAnsi="Arial" w:eastAsia="Arial"/>
           <w:color w:val="000000"/>
-          <w:sz w:val="22"/>
+          <w:sz w:val="21"/>
         </w:rPr>
         <w:t>Hộp kỹ thuật chống nước đầu nối chắc chắn cầu chì và bảo vệ quá áp.</w:t>
       </w:r>
@@ -3333,14 +3389,9 @@
         <w:rPr>
           <w:rFonts w:ascii="Arial" w:hAnsi="Arial" w:eastAsia="Arial"/>
           <w:color w:val="000000"/>
-          <w:sz w:val="22"/>
+          <w:sz w:val="21"/>
         </w:rPr>
         <w:t>Dây xoắn đôi cho đường A B và điện trở kết thúc khi cáp dài.</w:t>
-      </w:r>
-    </w:p>
-    <w:p>
-      <w:r>
-        <w:br w:type="page"/>
       </w:r>
     </w:p>
     <w:p>
@@ -3529,6 +3580,9 @@
         </w:tc>
       </w:tr>
       <w:tr>
+        <w:trPr>
+          <w:cantSplit w:val="true"/>
+        </w:trPr>
         <w:tc>
           <w:tcPr>
             <w:tcW w:type="dxa" w:w="2232"/>
@@ -3615,6 +3669,9 @@
         </w:tc>
       </w:tr>
       <w:tr>
+        <w:trPr>
+          <w:cantSplit w:val="true"/>
+        </w:trPr>
         <w:tc>
           <w:tcPr>
             <w:tcW w:type="dxa" w:w="2232"/>
@@ -3701,6 +3758,9 @@
         </w:tc>
       </w:tr>
       <w:tr>
+        <w:trPr>
+          <w:cantSplit w:val="true"/>
+        </w:trPr>
         <w:tc>
           <w:tcPr>
             <w:tcW w:type="dxa" w:w="2232"/>
@@ -3787,6 +3847,9 @@
         </w:tc>
       </w:tr>
       <w:tr>
+        <w:trPr>
+          <w:cantSplit w:val="true"/>
+        </w:trPr>
         <w:tc>
           <w:tcPr>
             <w:tcW w:type="dxa" w:w="2232"/>
@@ -3873,6 +3936,9 @@
         </w:tc>
       </w:tr>
       <w:tr>
+        <w:trPr>
+          <w:cantSplit w:val="true"/>
+        </w:trPr>
         <w:tc>
           <w:tcPr>
             <w:tcW w:type="dxa" w:w="2232"/>
@@ -3959,6 +4025,9 @@
         </w:tc>
       </w:tr>
       <w:tr>
+        <w:trPr>
+          <w:cantSplit w:val="true"/>
+        </w:trPr>
         <w:tc>
           <w:tcPr>
             <w:tcW w:type="dxa" w:w="2232"/>
@@ -4045,6 +4114,9 @@
         </w:tc>
       </w:tr>
       <w:tr>
+        <w:trPr>
+          <w:cantSplit w:val="true"/>
+        </w:trPr>
         <w:tc>
           <w:tcPr>
             <w:tcW w:type="dxa" w:w="2232"/>
@@ -4153,7 +4225,7 @@
         <w:rPr>
           <w:rFonts w:ascii="Arial" w:hAnsi="Arial" w:eastAsia="Arial"/>
           <w:color w:val="000000"/>
-          <w:sz w:val="22"/>
+          <w:sz w:val="21"/>
         </w:rPr>
         <w:t>Hiệu chuẩn cảm biến bằng phép đo đối chứng trước khi lắp ngoài trời.</w:t>
       </w:r>
@@ -4167,7 +4239,7 @@
         <w:rPr>
           <w:rFonts w:ascii="Arial" w:hAnsi="Arial" w:eastAsia="Arial"/>
           <w:color w:val="000000"/>
-          <w:sz w:val="22"/>
+          <w:sz w:val="21"/>
         </w:rPr>
         <w:t>Ghi dữ liệu liên tục theo chu kỳ 1 đến 3 phút trong cả ngày khô và ngày mưa.</w:t>
       </w:r>
@@ -4181,7 +4253,7 @@
         <w:rPr>
           <w:rFonts w:ascii="Arial" w:hAnsi="Arial" w:eastAsia="Arial"/>
           <w:color w:val="000000"/>
-          <w:sz w:val="22"/>
+          <w:sz w:val="21"/>
         </w:rPr>
         <w:t>Ghi nhật ký các sự kiện như mất điện vệ sinh cảm biến nghẽn rãnh hoặc thay vị trí thiết bị.</w:t>
       </w:r>
@@ -4195,7 +4267,7 @@
         <w:rPr>
           <w:rFonts w:ascii="Arial" w:hAnsi="Arial" w:eastAsia="Arial"/>
           <w:color w:val="000000"/>
-          <w:sz w:val="22"/>
+          <w:sz w:val="21"/>
         </w:rPr>
         <w:t>Tạo thí nghiệm bể nước hoặc máng thoát nước để kiểm tra cảm biến và pipeline nhưng gắn nhãn simulated.</w:t>
       </w:r>
@@ -4209,7 +4281,7 @@
         <w:rPr>
           <w:rFonts w:ascii="Arial" w:hAnsi="Arial" w:eastAsia="Arial"/>
           <w:color w:val="000000"/>
-          <w:sz w:val="22"/>
+          <w:sz w:val="21"/>
         </w:rPr>
         <w:t>Chỉ sử dụng sự kiện thực địa chưa xuất hiện trong train để báo cáo hiệu năng cuối cùng.</w:t>
       </w:r>
@@ -4335,6 +4407,9 @@
         </w:tc>
       </w:tr>
       <w:tr>
+        <w:trPr>
+          <w:cantSplit w:val="true"/>
+        </w:trPr>
         <w:tc>
           <w:tcPr>
             <w:tcW w:type="dxa" w:w="2448"/>
@@ -4421,6 +4496,9 @@
         </w:tc>
       </w:tr>
       <w:tr>
+        <w:trPr>
+          <w:cantSplit w:val="true"/>
+        </w:trPr>
         <w:tc>
           <w:tcPr>
             <w:tcW w:type="dxa" w:w="2448"/>
@@ -4507,6 +4585,9 @@
         </w:tc>
       </w:tr>
       <w:tr>
+        <w:trPr>
+          <w:cantSplit w:val="true"/>
+        </w:trPr>
         <w:tc>
           <w:tcPr>
             <w:tcW w:type="dxa" w:w="2448"/>
@@ -4593,6 +4674,9 @@
         </w:tc>
       </w:tr>
       <w:tr>
+        <w:trPr>
+          <w:cantSplit w:val="true"/>
+        </w:trPr>
         <w:tc>
           <w:tcPr>
             <w:tcW w:type="dxa" w:w="2448"/>
@@ -4700,7 +4784,7 @@
         <w:rPr>
           <w:rFonts w:ascii="Arial" w:hAnsi="Arial" w:eastAsia="Arial"/>
           <w:color w:val="000000"/>
-          <w:sz w:val="22"/>
+          <w:sz w:val="21"/>
         </w:rPr>
         <w:t>Dữ liệu phải được sắp theo thời gian và nhóm theo sự kiện mưa. Nhóm sử dụng các sự kiện đầu để huấn luyện các sự kiện tiếp theo để validation và giữ lại ít nhất một nhóm sự kiện cuối làm test. Nếu số sự kiện nguy hiểm quá ít kết quả phải được trình bày là thử nghiệm sơ bộ kèm số mẫu thực tế.</w:t>
       </w:r>
@@ -4826,6 +4910,9 @@
         </w:tc>
       </w:tr>
       <w:tr>
+        <w:trPr>
+          <w:cantSplit w:val="true"/>
+        </w:trPr>
         <w:tc>
           <w:tcPr>
             <w:tcW w:type="dxa" w:w="2016"/>
@@ -4912,6 +4999,9 @@
         </w:tc>
       </w:tr>
       <w:tr>
+        <w:trPr>
+          <w:cantSplit w:val="true"/>
+        </w:trPr>
         <w:tc>
           <w:tcPr>
             <w:tcW w:type="dxa" w:w="2016"/>
@@ -4998,6 +5088,9 @@
         </w:tc>
       </w:tr>
       <w:tr>
+        <w:trPr>
+          <w:cantSplit w:val="true"/>
+        </w:trPr>
         <w:tc>
           <w:tcPr>
             <w:tcW w:type="dxa" w:w="2016"/>
@@ -5084,6 +5177,9 @@
         </w:tc>
       </w:tr>
       <w:tr>
+        <w:trPr>
+          <w:cantSplit w:val="true"/>
+        </w:trPr>
         <w:tc>
           <w:tcPr>
             <w:tcW w:type="dxa" w:w="2016"/>
@@ -5170,6 +5266,9 @@
         </w:tc>
       </w:tr>
       <w:tr>
+        <w:trPr>
+          <w:cantSplit w:val="true"/>
+        </w:trPr>
         <w:tc>
           <w:tcPr>
             <w:tcW w:type="dxa" w:w="2016"/>
@@ -5256,6 +5355,9 @@
         </w:tc>
       </w:tr>
       <w:tr>
+        <w:trPr>
+          <w:cantSplit w:val="true"/>
+        </w:trPr>
         <w:tc>
           <w:tcPr>
             <w:tcW w:type="dxa" w:w="2016"/>
@@ -5364,7 +5466,7 @@
         <w:rPr>
           <w:rFonts w:ascii="Arial" w:hAnsi="Arial" w:eastAsia="Arial"/>
           <w:color w:val="000000"/>
-          <w:sz w:val="22"/>
+          <w:sz w:val="21"/>
         </w:rPr>
         <w:t>Pipeline ghi nhận được ít nhất 90 phần trăm chu kỳ dự kiến trong giai đoạn thử nghiệm.</w:t>
       </w:r>
@@ -5378,7 +5480,7 @@
         <w:rPr>
           <w:rFonts w:ascii="Arial" w:hAnsi="Arial" w:eastAsia="Arial"/>
           <w:color w:val="000000"/>
-          <w:sz w:val="22"/>
+          <w:sz w:val="21"/>
         </w:rPr>
         <w:t>Mô hình vượt baseline trên Recall lớp nguy hiểm và F1 Macro của tập sự kiện độc lập.</w:t>
       </w:r>
@@ -5392,7 +5494,7 @@
         <w:rPr>
           <w:rFonts w:ascii="Arial" w:hAnsi="Arial" w:eastAsia="Arial"/>
           <w:color w:val="000000"/>
-          <w:sz w:val="22"/>
+          <w:sz w:val="21"/>
         </w:rPr>
         <w:t>Thời gian cảnh báo trung vị đạt ít nhất 15 phút trên các sự kiện phát hiện đúng.</w:t>
       </w:r>
@@ -5406,14 +5508,9 @@
         <w:rPr>
           <w:rFonts w:ascii="Arial" w:hAnsi="Arial" w:eastAsia="Arial"/>
           <w:color w:val="000000"/>
-          <w:sz w:val="22"/>
+          <w:sz w:val="21"/>
         </w:rPr>
         <w:t>Mỗi kết quả báo cáo kèm số mẫu số sự kiện và ma trận nhầm lẫn thay vì chỉ nêu Accuracy.</w:t>
-      </w:r>
-    </w:p>
-    <w:p>
-      <w:r>
-        <w:br w:type="page"/>
       </w:r>
     </w:p>
     <w:p>
@@ -5433,7 +5530,7 @@
         <w:rPr>
           <w:rFonts w:ascii="Arial" w:hAnsi="Arial" w:eastAsia="Arial"/>
           <w:color w:val="000000"/>
-          <w:sz w:val="22"/>
+          <w:sz w:val="21"/>
         </w:rPr>
         <w:t>Hiển thị mưa mực nước tốc độ dâng và trạng thái kết nối theo cùng dấu thời gian.</w:t>
       </w:r>
@@ -5447,7 +5544,7 @@
         <w:rPr>
           <w:rFonts w:ascii="Arial" w:hAnsi="Arial" w:eastAsia="Arial"/>
           <w:color w:val="000000"/>
-          <w:sz w:val="22"/>
+          <w:sz w:val="21"/>
         </w:rPr>
         <w:t>Tách rõ dự báo 15 phút dự báo 30 phút và cảnh báo bối cảnh 24 giờ.</w:t>
       </w:r>
@@ -5461,7 +5558,7 @@
         <w:rPr>
           <w:rFonts w:ascii="Arial" w:hAnsi="Arial" w:eastAsia="Arial"/>
           <w:color w:val="000000"/>
-          <w:sz w:val="22"/>
+          <w:sz w:val="21"/>
         </w:rPr>
         <w:t>Mỗi cảnh báo phải ghi model version input timestamp xác suất và kết quả gửi Telegram.</w:t>
       </w:r>
@@ -5475,7 +5572,7 @@
         <w:rPr>
           <w:rFonts w:ascii="Arial" w:hAnsi="Arial" w:eastAsia="Arial"/>
           <w:color w:val="000000"/>
-          <w:sz w:val="22"/>
+          <w:sz w:val="21"/>
         </w:rPr>
         <w:t>Cho phép người phụ trách xác nhận cảnh báo đúng sai để tạo dữ liệu phản hồi.</w:t>
       </w:r>
@@ -5489,7 +5586,7 @@
         <w:rPr>
           <w:rFonts w:ascii="Arial" w:hAnsi="Arial" w:eastAsia="Arial"/>
           <w:color w:val="000000"/>
-          <w:sz w:val="22"/>
+          <w:sz w:val="21"/>
         </w:rPr>
         <w:t>Khi mất model hoặc mất Internet hệ thống chuyển sang luật ngưỡng an toàn và báo lỗi thiết bị.</w:t>
       </w:r>
@@ -5615,6 +5712,9 @@
         </w:tc>
       </w:tr>
       <w:tr>
+        <w:trPr>
+          <w:cantSplit w:val="true"/>
+        </w:trPr>
         <w:tc>
           <w:tcPr>
             <w:tcW w:type="dxa" w:w="1512"/>
@@ -5701,6 +5801,9 @@
         </w:tc>
       </w:tr>
       <w:tr>
+        <w:trPr>
+          <w:cantSplit w:val="true"/>
+        </w:trPr>
         <w:tc>
           <w:tcPr>
             <w:tcW w:type="dxa" w:w="1512"/>
@@ -5787,6 +5890,9 @@
         </w:tc>
       </w:tr>
       <w:tr>
+        <w:trPr>
+          <w:cantSplit w:val="true"/>
+        </w:trPr>
         <w:tc>
           <w:tcPr>
             <w:tcW w:type="dxa" w:w="1512"/>
@@ -5873,6 +5979,9 @@
         </w:tc>
       </w:tr>
       <w:tr>
+        <w:trPr>
+          <w:cantSplit w:val="true"/>
+        </w:trPr>
         <w:tc>
           <w:tcPr>
             <w:tcW w:type="dxa" w:w="1512"/>
@@ -5959,6 +6068,9 @@
         </w:tc>
       </w:tr>
       <w:tr>
+        <w:trPr>
+          <w:cantSplit w:val="true"/>
+        </w:trPr>
         <w:tc>
           <w:tcPr>
             <w:tcW w:type="dxa" w:w="1512"/>
@@ -6045,6 +6157,9 @@
         </w:tc>
       </w:tr>
       <w:tr>
+        <w:trPr>
+          <w:cantSplit w:val="true"/>
+        </w:trPr>
         <w:tc>
           <w:tcPr>
             <w:tcW w:type="dxa" w:w="1512"/>
@@ -6257,6 +6372,9 @@
         </w:tc>
       </w:tr>
       <w:tr>
+        <w:trPr>
+          <w:cantSplit w:val="true"/>
+        </w:trPr>
         <w:tc>
           <w:tcPr>
             <w:tcW w:type="dxa" w:w="2088"/>
@@ -6343,6 +6461,9 @@
         </w:tc>
       </w:tr>
       <w:tr>
+        <w:trPr>
+          <w:cantSplit w:val="true"/>
+        </w:trPr>
         <w:tc>
           <w:tcPr>
             <w:tcW w:type="dxa" w:w="2088"/>
@@ -6429,6 +6550,9 @@
         </w:tc>
       </w:tr>
       <w:tr>
+        <w:trPr>
+          <w:cantSplit w:val="true"/>
+        </w:trPr>
         <w:tc>
           <w:tcPr>
             <w:tcW w:type="dxa" w:w="2088"/>
@@ -6515,6 +6639,9 @@
         </w:tc>
       </w:tr>
       <w:tr>
+        <w:trPr>
+          <w:cantSplit w:val="true"/>
+        </w:trPr>
         <w:tc>
           <w:tcPr>
             <w:tcW w:type="dxa" w:w="2088"/>
@@ -6601,6 +6728,9 @@
         </w:tc>
       </w:tr>
       <w:tr>
+        <w:trPr>
+          <w:cantSplit w:val="true"/>
+        </w:trPr>
         <w:tc>
           <w:tcPr>
             <w:tcW w:type="dxa" w:w="2088"/>
@@ -6687,6 +6817,9 @@
         </w:tc>
       </w:tr>
       <w:tr>
+        <w:trPr>
+          <w:cantSplit w:val="true"/>
+        </w:trPr>
         <w:tc>
           <w:tcPr>
             <w:tcW w:type="dxa" w:w="2088"/>
@@ -6795,7 +6928,7 @@
         <w:rPr>
           <w:rFonts w:ascii="Arial" w:hAnsi="Arial" w:eastAsia="Arial"/>
           <w:color w:val="000000"/>
-          <w:sz w:val="22"/>
+          <w:sz w:val="21"/>
         </w:rPr>
         <w:t>Một trạm ESP32 đọc cảm biến mưa RS485 và cảm biến mực nước.</w:t>
       </w:r>
@@ -6809,7 +6942,7 @@
         <w:rPr>
           <w:rFonts w:ascii="Arial" w:hAnsi="Arial" w:eastAsia="Arial"/>
           <w:color w:val="000000"/>
-          <w:sz w:val="22"/>
+          <w:sz w:val="21"/>
         </w:rPr>
         <w:t>Một kho dữ liệu chuỗi thời gian có tài liệu mô tả trường và nguồn dữ liệu.</w:t>
       </w:r>
@@ -6823,7 +6956,7 @@
         <w:rPr>
           <w:rFonts w:ascii="Arial" w:hAnsi="Arial" w:eastAsia="Arial"/>
           <w:color w:val="000000"/>
-          <w:sz w:val="22"/>
+          <w:sz w:val="21"/>
         </w:rPr>
         <w:t>Các mô hình baseline Logistic Regression Decision Tree và Random Forest đã đánh giá theo thời gian.</w:t>
       </w:r>
@@ -6837,7 +6970,7 @@
         <w:rPr>
           <w:rFonts w:ascii="Arial" w:hAnsi="Arial" w:eastAsia="Arial"/>
           <w:color w:val="000000"/>
-          <w:sz w:val="22"/>
+          <w:sz w:val="21"/>
         </w:rPr>
         <w:t>Dashboard giám sát và cảnh báo Telegram có nhật ký kết quả gửi.</w:t>
       </w:r>
@@ -6851,7 +6984,7 @@
         <w:rPr>
           <w:rFonts w:ascii="Arial" w:hAnsi="Arial" w:eastAsia="Arial"/>
           <w:color w:val="000000"/>
-          <w:sz w:val="22"/>
+          <w:sz w:val="21"/>
         </w:rPr>
         <w:t>Báo cáo khoa học poster sơ đồ mạch mã nguồn và video thử nghiệm.</w:t>
       </w:r>
@@ -6872,7 +7005,7 @@
         <w:rPr>
           <w:rFonts w:ascii="Arial" w:hAnsi="Arial" w:eastAsia="Arial"/>
           <w:color w:val="000000"/>
-          <w:sz w:val="22"/>
+          <w:sz w:val="21"/>
         </w:rPr>
         <w:t>Phiên bản 2 chuyển đề tài từ một mô hình minh họa chung thành một nghiên cứu có thể kiểm chứng tại một điểm ngập cụ thể. Trọng tâm của đề tài là đo đúng gán nhãn đúng và đánh giá trên sự kiện chưa từng thấy. AI chỉ được xem là có giá trị khi vượt baseline và tạo được thời gian báo trước thực tế mà không làm số cảnh báo giả tăng đến mức không thể sử dụng.</w:t>
       </w:r>
@@ -6894,7 +7027,7 @@
         <w:rPr>
           <w:rFonts w:ascii="Arial" w:hAnsi="Arial" w:eastAsia="Arial"/>
           <w:color w:val="000000"/>
-          <w:sz w:val="22"/>
+          <w:sz w:val="21"/>
         </w:rPr>
         <w:t>Bản đề xuất dự án nghiên cứu khoa học kỹ thuật phiên bản 1 năm học 2026 2027.</w:t>
       </w:r>
@@ -6908,9 +7041,9 @@
         <w:rPr>
           <w:rFonts w:ascii="Arial" w:hAnsi="Arial" w:eastAsia="Arial"/>
           <w:color w:val="000000"/>
-          <w:sz w:val="22"/>
+          <w:sz w:val="21"/>
         </w:rPr>
-        <w:t>Mã nguồn và dataset hiện tại của dự án AI IoT dự báo nguy cơ ngập Hội An.</w:t>
+        <w:t>Mã nguồn dataset hiện tại và kho bản tin khí tượng thủy văn đã lưu trong dự án.</w:t>
       </w:r>
     </w:p>
     <w:p>
@@ -6922,37 +7055,9 @@
         <w:rPr>
           <w:rFonts w:ascii="Arial" w:hAnsi="Arial" w:eastAsia="Arial"/>
           <w:color w:val="000000"/>
-          <w:sz w:val="22"/>
+          <w:sz w:val="21"/>
         </w:rPr>
-        <w:t>Kho bản tin khí tượng thủy văn đã lưu trong dự án.</w:t>
-      </w:r>
-    </w:p>
-    <w:p>
-      <w:pPr>
-        <w:pStyle w:val="ListBullet"/>
-        <w:spacing w:after="60"/>
-      </w:pPr>
-      <w:r>
-        <w:rPr>
-          <w:rFonts w:ascii="Arial" w:hAnsi="Arial" w:eastAsia="Arial"/>
-          <w:color w:val="000000"/>
-          <w:sz w:val="22"/>
-        </w:rPr>
-        <w:t>Dữ liệu mưa lịch sử và dự báo từ nguồn API được ghi rõ trong metadata khi sử dụng.</w:t>
-      </w:r>
-    </w:p>
-    <w:p>
-      <w:pPr>
-        <w:pStyle w:val="ListBullet"/>
-        <w:spacing w:after="60"/>
-      </w:pPr>
-      <w:r>
-        <w:rPr>
-          <w:rFonts w:ascii="Arial" w:hAnsi="Arial" w:eastAsia="Arial"/>
-          <w:color w:val="000000"/>
-          <w:sz w:val="22"/>
-        </w:rPr>
-        <w:t>Dữ liệu lưu lượng mô phỏng chỉ được dùng như nguồn bên ngoài và không được gọi là quan trắc thực địa.</w:t>
+        <w:t>Dữ liệu API phải được ghi nguồn trong metadata và dữ liệu lưu lượng mô phỏng không được gọi là quan trắc thực địa.</w:t>
       </w:r>
     </w:p>
     <w:sectPr>
@@ -7359,12 +7464,12 @@
     <w:qFormat/>
     <w:rsid w:val="00FC693F"/>
     <w:pPr>
-      <w:spacing w:after="120" w:line="269" w:lineRule="auto"/>
+      <w:spacing w:after="100" w:line="259" w:lineRule="auto"/>
     </w:pPr>
     <w:rPr>
       <w:rFonts w:ascii="Arial" w:hAnsi="Arial" w:eastAsia="Arial"/>
       <w:color w:val="000000"/>
-      <w:sz w:val="22"/>
+      <w:sz w:val="21"/>
     </w:rPr>
   </w:style>
   <w:style w:type="paragraph" w:styleId="Header">
@@ -7709,9 +7814,6 @@
     <w:qFormat/>
     <w:rsid w:val="00FC693F"/>
     <w:pPr>
-      <w:pBdr>
-        <w:bottom w:val="single" w:sz="8" w:space="4" w:color="4F81BD" w:themeColor="accent1"/>
-      </w:pBdr>
       <w:spacing w:after="280" w:line="240" w:lineRule="auto"/>
       <w:contextualSpacing/>
     </w:pPr>

</xml_diff>

<commit_message>
feat(iot): implement mini flood AI-IoT telemetry, simulation and E2E tests
- Add mini_flood package: config, db, feature engineering (8 features), models registry, notifications (Telegram/Email), schemas
- Add FastAPI telemetry ingest API with dedup, auth and auto background delivery
- Add Wokwi simulation firmware (sketch.ino) with HTTP POST, offline buffer, offline safety tree fallback, actuators (LED RGB + buzzer) and README
- Add complete E2E test suites: test_e2e_iot_flow (3 scenarios: normal/warning/danger), test_e2e_alert_delivery (independent channels, 30m reminder, 2-cycle recovery), test_e2e_offline_buffer (reconnect flush & stale timestamp)
- Update RUNBOOK and docs with proposal V1 and operational guides
</commit_message>
<xml_diff>
--- a/output/docx/Ban_de_xuat_cai_tien_he_thong_du_bao_ngap_V2.docx
+++ b/output/docx/Ban_de_xuat_cai_tien_he_thong_du_bao_ngap_V2.docx
@@ -1242,7 +1242,7 @@
         <w:drawing>
           <wp:inline xmlns:a="http://schemas.openxmlformats.org/drawingml/2006/main" xmlns:pic="http://schemas.openxmlformats.org/drawingml/2006/picture">
             <wp:extent cx="6263640" cy="3340608"/>
-            <wp:docPr id="1" name="Picture 1"/>
+            <wp:docPr id="1" name="Picture 1" descr="Hình 1  Kiến trúc hai lớp của hệ thống cải tiến" title="Hình 1  Kiến trúc hai lớp của hệ thống cải tiến"/>
             <wp:cNvGraphicFramePr>
               <a:graphicFrameLocks noChangeAspect="1"/>
             </wp:cNvGraphicFramePr>
@@ -3411,7 +3411,7 @@
         <w:drawing>
           <wp:inline xmlns:a="http://schemas.openxmlformats.org/drawingml/2006/main" xmlns:pic="http://schemas.openxmlformats.org/drawingml/2006/picture">
             <wp:extent cx="6263640" cy="2453259"/>
-            <wp:docPr id="2" name="Picture 2"/>
+            <wp:docPr id="2" name="Picture 2" descr="Hình 2  Quy trình nghiên cứu và kiểm định dữ liệu" title="Hình 2  Quy trình nghiên cứu và kiểm định dữ liệu"/>
             <wp:cNvGraphicFramePr>
               <a:graphicFrameLocks noChangeAspect="1"/>
             </wp:cNvGraphicFramePr>
@@ -7043,21 +7043,7 @@
           <w:color w:val="000000"/>
           <w:sz w:val="21"/>
         </w:rPr>
-        <w:t>Mã nguồn dataset hiện tại và kho bản tin khí tượng thủy văn đã lưu trong dự án.</w:t>
-      </w:r>
-    </w:p>
-    <w:p>
-      <w:pPr>
-        <w:pStyle w:val="ListBullet"/>
-        <w:spacing w:after="60"/>
-      </w:pPr>
-      <w:r>
-        <w:rPr>
-          <w:rFonts w:ascii="Arial" w:hAnsi="Arial" w:eastAsia="Arial"/>
-          <w:color w:val="000000"/>
-          <w:sz w:val="21"/>
-        </w:rPr>
-        <w:t>Dữ liệu API phải được ghi nguồn trong metadata và dữ liệu lưu lượng mô phỏng không được gọi là quan trắc thực địa.</w:t>
+        <w:t>Mã nguồn dataset, bản tin khí tượng thủy văn và dữ liệu API có metadata của dự án; dữ liệu mô phỏng được ghi riêng với quan trắc thực địa.</w:t>
       </w:r>
     </w:p>
     <w:sectPr>

</xml_diff>